<commit_message>
feat: add user feedback modal system and update thesis reports and documentation
</commit_message>
<xml_diff>
--- a/QSMS_Project_Thesis_Report.docx
+++ b/QSMS_Project_Thesis_Report.docx
@@ -57,7 +57,7 @@
         </w:rPr>
         <w:t>ระบบบริหารจัดการกระบวนการแก้ไขผลิตภัณฑ์</w:t>
         <w:br/>
-        <w:t>และคลังเอกสารวิศวกรรมอัจฉริยะ</w:t>
+        <w:t>และคลังเอกสารข้อกำหนดมาตรฐานการผลิตอัจฉริยะ</w:t>
         <w:br/>
         <w:t>(QSMS: Quality &amp; Rework Management System)</w:t>
       </w:r>
@@ -77,7 +77,7 @@
         </w:rPr>
         <w:t>QSMS: QUALITY AND REWORK MANAGEMENT SYSTEM WITH</w:t>
         <w:br/>
-        <w:t>INTELLIGENT ENGINEERING DOCUMENT ANALYSIS AND</w:t>
+        <w:t>INTELLIGENT MANUFACTURING SPECIFICATIONS AND</w:t>
         <w:br/>
         <w:t>RETRIEVAL-AUGMENTED GENERATION</w:t>
       </w:r>
@@ -168,7 +168,7 @@
           <w:sz w:val="32"/>
           <w:rFonts w:ascii="TH Sarabun New" w:hAnsi="TH Sarabun New" w:cs="TH Sarabun New" w:eastAsia="TH Sarabun New"/>
         </w:rPr>
-        <w:t>หัวข้อปริญญานิพนธ์:  ระบบบริหารจัดการกระบวนการแก้ไขผลิตภัณฑ์และคลังเอกสารวิศวกรรมอัจฉริยะ (QSMS)</w:t>
+        <w:t>หัวข้อปริญญานิพนธ์:  ระบบบริหารจัดการกระบวนการแก้ไขผลิตภัณฑ์และคลังเอกสารข้อกำหนดมาตรฐานการผลิตอัจฉริยะ (QSMS)</w:t>
         <w:br/>
         <w:t>ผู้จัดทำ:  นายสพลฎณัย ชัยพงษ์ (รหัสนักศึกษา 6752500398)</w:t>
         <w:br/>
@@ -249,7 +249,7 @@
           <w:sz w:val="32"/>
           <w:rFonts w:ascii="TH Sarabun New" w:hAnsi="TH Sarabun New" w:cs="TH Sarabun New" w:eastAsia="TH Sarabun New"/>
         </w:rPr>
-        <w:t>ปริญญานิพนธ์ฉบับนี้นำเสนอการวิจัยและการพัฒนาระบบบริหารจัดการกระบวนการแก้ไขผลิตภัณฑ์และคลังเอกสารวิศวกรรมอัจฉริยะ (QSMS: Quality &amp; Rework Management System) เพื่อแก้ปัญหาในสายการผลิตอุตสาหกรรมบรรจุภัณฑ์ที่พบความล่าช้า ข้อมูลรหัสสินค้าและล็อตการผลิตคลาดเคลื่อน ขาดภาพถ่ายหลักฐานเชิงประจักษ์ และใช้เวลานานในการสืบค้นคู่มือเทคนิคและแบบแปลนวิศวกรรม</w:t>
+        <w:t>ปริญญานิพนธ์ฉบับนี้นำเสนอการวิจัยและการพัฒนาระบบบริหารจัดการกระบวนการแก้ไขผลิตภัณฑ์และคลังเอกสารข้อกำหนดมาตรฐานการผลิตอัจฉริยะ (QSMS: Quality &amp; Rework Management System) เพื่อแก้ปัญหาในสายการผลิตอุตสาหกรรมบรรจุภัณฑ์ที่พบความล่าช้า ข้อมูลรหัสสินค้าและล็อตการผลิตคลาดเคลื่อน ขาดภาพถ่ายหลักฐานเชิงประจักษ์ และใช้เวลานานในการสืบค้นคู่มือเทคนิคและแบบร่างสูตรการผลิต</w:t>
       </w:r>
     </w:p>
     <w:p>
@@ -267,7 +267,7 @@
           <w:sz w:val="32"/>
           <w:rFonts w:ascii="TH Sarabun New" w:hAnsi="TH Sarabun New" w:cs="TH Sarabun New" w:eastAsia="TH Sarabun New"/>
         </w:rPr>
-        <w:t>ระบบ QSMS ถูกออกแบบด้วยสถาปัตยกรรม Hybrid Next.js 16 App Router ร่วมกับ React 19 Client Shell ภายใต้โครงสร้าง Feature-Sliced Design (FSD) โดยใช้ Supabase PostgreSQL และ pgvector เป็นฐานข้อมูลหลัก และเชื่อมต่อ Cloudinary CDN สำหรับจัดเก็บภาพถ่ายหลักฐานที่บีบอัดฝั่งไคลเอนต์ ระบบประกอบด้วย 6 โมดูลหลัก ได้แก่ (1) ระบบจัดการเคส Rework พร้อมการตรวจสอบรหัสสินค้าอัตโนมัติ (Two-Way Autofill) และการรักษาความสมบูรณ์ของหลักฐาน (Evidence Integrity) (2) ระบบคลังแบบแปลนและใบมาสเตอร์วิศวกรรมที่ใช้ Gemini Multimodal OCR สกัดข้อมูลแบบแยกสกีมา (Decoupled Schemas) ร่วมกับแผงตรวจทาน Split View 55/45 (3) ระบบถามตอบคู่มืออัจฉริยะ DocAI RAG แชทบอท 'น้องผึ้งพา' ที่ใช้ Jina Embeddings 768 มิติ ร่วมกับ Hybrid Search และ Function Calling สถิติสด (4) ระบบจัดตารางเวรพนักงาน ShiftHub Roster (5) ระบบส่งออกรายงานสเปรดชีต Excel (.xlsx) ที่ฝังรูปภาพหลักฐานความสูง 120px ในเซลล์ และ (6) ระบบคู่มือนำเสนอเชิงโต้ตอบ (Presentation Deck) 20 สไลด์ พร้อมระบบควบคุมมุมมอง Direct-Manipulation 1:1 Zoom/Pan Engine</w:t>
+        <w:t>ระบบ QSMS ถูกออกแบบด้วยสถาปัตยกรรม Hybrid Next.js 16 App Router ร่วมกับ React 19 Client Shell ภายใต้โครงสร้าง Feature-Sliced Design (FSD) โดยใช้ Supabase PostgreSQL และ pgvector เป็นฐานข้อมูลหลัก และเชื่อมต่อ Cloudinary CDN สำหรับจัดเก็บภาพถ่ายหลักฐานที่บีบอัดฝั่งไคลเอนต์ ระบบประกอบด้วย 5 โมดูลหลัก ได้แก่ (1) ระบบจัดการเคส Rework พร้อมการตรวจสอบรหัสสินค้าสองทางอัตโนมัติ (Two-Way Autofill) และการรักษาความสมบูรณ์ของหลักฐาน (Evidence Integrity) (2) ระบบคลังแบบร่างข้อกำหนดผลิตภัณฑ์ (Customer Drawings) และใบกำหนดสูตรมาตรฐานการผลิต (Manufacturing Master Sheets) ที่ใช้ Gemini Multimodal OCR สกัดข้อมูลแบบแยกสกีมา (Decoupled Schemas) ร่วมกับแผงตรวจทาน Split View 55/45 (3) ระบบถามตอบคู่มืออัจฉริยะ DocAI RAG แชทบอท 'น้องผึ้งพา' ที่ใช้ Jina Embeddings 768 มิติ ร่วมกับ Hybrid Search และ Function Calling สถิติสด (4) ระบบส่งออกรายงานสเปรดชีต Excel (.xlsx) ที่ฝังรูปภาพหลักฐานความสูง 120px ในเซลล์ และ (5) ระบบคู่มือนำเสนอเชิงโต้ตอบ (Presentation Deck) 20 สไลด์ พร้อมระบบควบคุมมุมมอง Direct-Manipulation 1:1 Zoom/Pan Engine</w:t>
       </w:r>
     </w:p>
     <w:p>
@@ -285,7 +285,7 @@
           <w:sz w:val="32"/>
           <w:rFonts w:ascii="TH Sarabun New" w:hAnsi="TH Sarabun New" w:cs="TH Sarabun New" w:eastAsia="TH Sarabun New"/>
         </w:rPr>
-        <w:t>ผลการทดสอบเชิงฟังก์ชันและการตรวจสอบความถูกต้องอัตโนมัติผ่าน Vitest พบว่าผ่านการทดสอบ 131 เคสการทดสอบ (100% Pass Rate) และผ่านการตรวจสอบ Type Safety (TypeScript) โดยปราศจากข้อผิดพลาด ระบบสามารถลดเวลาในการบันทึกและตรวจสอบข้อมูลเคส Rework ลงได้ 66.4% ลดข้อผิดพลาดของรหัสสินค้าเหลือ 0% และลดเวลาสืบค้นคู่มือเทคนิคจาก 18 นาทีเหลือเพียง 45 วินาที แสดงให้เห็นว่าระบบสามารถนำไปประยุกต์ใช้งานจริงในโรงงานอุตสาหกรรมได้อย่างมีประสิทธิภาพ ปลอดภัย และเสถียรภาพสูง</w:t>
+        <w:t>ผลการทดสอบเชิงฟังก์ชันและการตรวจสอบความถูกต้องอัตโนมัติผ่าน Vitest พบว่าผ่านการทดสอบ 131 เคสการทดสอบ (100% Pass Rate) และผ่านการตรวจสอบ Type Safety (TypeScript) โดยปราศจากข้อผิดพลาด ระบบสามารถลดเวลาในการบันทึกและตรวจสอบข้อมูลเคส Rework ลงได้ 66.4% ลดข้อผิดพลาดของรหัสสินค้าเหลือ 0% และลดเวลาสืบค้นเอกสารข้อกำหนดและคู่มือเทคนิคจาก 18 นาทีเหลือเพียง 45 วินาที แสดงให้เห็นว่าระบบสามารถนำไปประยุกต์ใช้งานจริงในโรงงานอุตสาหกรรมได้อย่างมีประสิทธิภาพ ปลอดภัย และเสถียรภาพสูง</w:t>
       </w:r>
     </w:p>
     <w:p>
@@ -349,7 +349,7 @@
           <w:sz w:val="32"/>
           <w:rFonts w:ascii="TH Sarabun New" w:hAnsi="TH Sarabun New" w:cs="TH Sarabun New" w:eastAsia="TH Sarabun New"/>
         </w:rPr>
-        <w:t>This thesis presents the design and implementation of the QSMS: Quality and Rework Management System with Intelligent Engineering Document Analysis and Retrieval-Augmented Generation by Mr. Saphondanai Chaiyaphong (Student ID: 6752500398), Bachelor of Engineering in Automated Robotics Engineering, Faculty of Engineering and Technology, Panyapiwat Institute of Management. The project addresses core manufacturing bottlenecks including manual paperwork latency, product item code discrepancies, lack of verifiable evidence images, and time-consuming technical drawing retrievals in industrial packaging operations.</w:t>
+        <w:t>This thesis presents the design and implementation of the QSMS: Quality and Rework Management System with Intelligent Manufacturing Specifications and Retrieval-Augmented Generation by Mr. Saphondanai Chaiyaphong (Student ID: 6752500398), Bachelor of Engineering in Automated Robotics Engineering, Faculty of Engineering and Technology, Panyapiwat Institute of Management. The project addresses core manufacturing bottlenecks including manual paperwork latency, product item code discrepancies, lack of verifiable evidence images, and time-consuming specification document retrievals in industrial packaging operations.</w:t>
       </w:r>
     </w:p>
     <w:p>
@@ -367,7 +367,7 @@
           <w:sz w:val="32"/>
           <w:rFonts w:ascii="TH Sarabun New" w:hAnsi="TH Sarabun New" w:cs="TH Sarabun New" w:eastAsia="TH Sarabun New"/>
         </w:rPr>
-        <w:t>QSMS is engineered with a Hybrid Next.js 16 App Router architecture paired with React 19 Client-Side state management, organized under Feature-Sliced Design (FSD) principles. Supabase PostgreSQL and pgvector serve as the relational and vector database, coupled with Cloudinary CDN for direct unsigned media storage. The platform comprises six modules: (1) Rework Management with two-way item autofill and atomic evidence integrity gating, (2) Engineering Drawings &amp; Master Repository powered by Gemini Multimodal OCR with decoupled schema extraction and a 55/45 split-view inspection workspace, (3) DocAI RAG engine utilizing Jina Embeddings (768 dimensions), PostgreSQL hybrid search, and live statistics function calling, (4) ShiftHub Roster workforce scheduling, (5) Styled Excel (.xlsx) report generation with native 120px embedded evidence photos, and (6) an Interactive Presentation Deck featuring Apple Liquid Glass styling and a direct-manipulation 1:1 hardware-accelerated zoom/pan engine.</w:t>
+        <w:t>QSMS is engineered with a Hybrid Next.js 16 App Router architecture paired with React 19 Client-Side state management, organized under Feature-Sliced Design (FSD) principles. Supabase PostgreSQL and pgvector serve as the relational and vector database, coupled with Cloudinary CDN for direct unsigned media storage. The platform comprises five integrated modules: (1) Rework Management with two-way item autofill and atomic evidence integrity gating, (2) Product Specifications &amp; Manufacturing Masters Repository powered by Gemini Multimodal OCR with decoupled schema extraction and a 55/45 split-view inspection workspace, (3) DocAI RAG engine utilizing Jina Embeddings (768 dimensions), PostgreSQL hybrid search, and live statistics function calling, (4) Styled Excel (.xlsx) report generation with native 120px embedded evidence photos, and (5) an Interactive Presentation Deck featuring Apple Liquid Glass styling and a direct-manipulation 1:1 hardware-accelerated zoom/pan engine.</w:t>
       </w:r>
     </w:p>
     <w:p>
@@ -2575,7 +2575,7 @@
                 <w:sz w:val="30"/>
                 <w:rFonts w:ascii="TH Sarabun New" w:hAnsi="TH Sarabun New" w:cs="TH Sarabun New" w:eastAsia="TH Sarabun New"/>
               </w:rPr>
-              <w:t>ภาพที่ 4.2 หน้าต่างฟอร์มบันทึกเคส Rework พร้อม Two-Way Autofill</w:t>
+              <w:t>ภาพที่ 4.2 หน้าต่างฟอร์มบันทึกเคส Rework พร้อม Two-Way Autofill และการตรวจสอบความถูกต้อง</w:t>
             </w:r>
           </w:p>
         </w:tc>
@@ -2620,7 +2620,7 @@
                 <w:sz w:val="30"/>
                 <w:rFonts w:ascii="TH Sarabun New" w:hAnsi="TH Sarabun New" w:cs="TH Sarabun New" w:eastAsia="TH Sarabun New"/>
               </w:rPr>
-              <w:t>ภาพที่ 4.3 แผงตรวจทานแบบแปลนวิศวกรรม Split View 55/45 พร้อมเครื่องมือหมุน PDF</w:t>
+              <w:t>ภาพที่ 4.3 แผงตรวจทานเอกสารข้อกำหนดผลิตภัณฑ์และสูตรมาตรฐานการผลิต Split View 55/45 พร้อมเครื่องมือหมุน PDF</w:t>
             </w:r>
           </w:p>
         </w:tc>
@@ -2642,7 +2642,7 @@
                 <w:sz w:val="30"/>
                 <w:rFonts w:ascii="TH Sarabun New" w:hAnsi="TH Sarabun New" w:cs="TH Sarabun New" w:eastAsia="TH Sarabun New"/>
               </w:rPr>
-              <w:t>20</w:t>
+              <w:t>21</w:t>
             </w:r>
           </w:p>
         </w:tc>
@@ -2687,7 +2687,7 @@
                 <w:sz w:val="30"/>
                 <w:rFonts w:ascii="TH Sarabun New" w:hAnsi="TH Sarabun New" w:cs="TH Sarabun New" w:eastAsia="TH Sarabun New"/>
               </w:rPr>
-              <w:t>21</w:t>
+              <w:t>22</w:t>
             </w:r>
           </w:p>
         </w:tc>
@@ -2732,51 +2732,6 @@
                 <w:sz w:val="30"/>
                 <w:rFonts w:ascii="TH Sarabun New" w:hAnsi="TH Sarabun New" w:cs="TH Sarabun New" w:eastAsia="TH Sarabun New"/>
               </w:rPr>
-              <w:t>22</w:t>
-            </w:r>
-          </w:p>
-        </w:tc>
-      </w:tr>
-      <w:tr>
-        <w:tc>
-          <w:tcPr>
-            <w:tcW w:type="dxa" w:w="4154"/>
-          </w:tcPr>
-          <w:p>
-            <w:pPr>
-              <w:spacing w:before="60" w:after="60"/>
-            </w:pPr>
-            <w:r/>
-            <w:r>
-              <w:rPr>
-                <w:rFonts w:ascii="TH Sarabun New" w:hAnsi="TH Sarabun New"/>
-                <w:b w:val="0"/>
-                <w:i w:val="0"/>
-                <w:sz w:val="30"/>
-                <w:rFonts w:ascii="TH Sarabun New" w:hAnsi="TH Sarabun New" w:cs="TH Sarabun New" w:eastAsia="TH Sarabun New"/>
-              </w:rPr>
-              <w:t>ภาพที่ 4.6 ปฏิทินและระบบจัดตารางเวรพนักงาน ShiftHub Roster</w:t>
-            </w:r>
-          </w:p>
-        </w:tc>
-        <w:tc>
-          <w:tcPr>
-            <w:tcW w:type="dxa" w:w="4154"/>
-          </w:tcPr>
-          <w:p>
-            <w:pPr>
-              <w:spacing w:before="60" w:after="60"/>
-              <w:jc w:val="right"/>
-            </w:pPr>
-            <w:r/>
-            <w:r>
-              <w:rPr>
-                <w:rFonts w:ascii="TH Sarabun New" w:hAnsi="TH Sarabun New"/>
-                <w:b w:val="0"/>
-                <w:i w:val="0"/>
-                <w:sz w:val="30"/>
-                <w:rFonts w:ascii="TH Sarabun New" w:hAnsi="TH Sarabun New" w:cs="TH Sarabun New" w:eastAsia="TH Sarabun New"/>
-              </w:rPr>
               <w:t>23</w:t>
             </w:r>
           </w:p>
@@ -2800,7 +2755,7 @@
                 <w:sz w:val="30"/>
                 <w:rFonts w:ascii="TH Sarabun New" w:hAnsi="TH Sarabun New" w:cs="TH Sarabun New" w:eastAsia="TH Sarabun New"/>
               </w:rPr>
-              <w:t>ภาพที่ 4.7 สไลด์คู่มือนำเสนอระบบ (Presentation Deck) และระบบ Direct-Manipulation Zoom/Pan</w:t>
+              <w:t>ภาพที่ 4.6 สไลด์คู่มือนำเสนอระบบ (Presentation Deck) และระบบ Direct-Manipulation Zoom/Pan</w:t>
             </w:r>
           </w:p>
         </w:tc>
@@ -2926,7 +2881,7 @@
           <w:sz w:val="32"/>
           <w:rFonts w:ascii="TH Sarabun New" w:hAnsi="TH Sarabun New" w:cs="TH Sarabun New" w:eastAsia="TH Sarabun New"/>
         </w:rPr>
-        <w:t>จากการศึกษาสภาพการปฏิบัติงานจริงในสายการผลิต พบว่ากระบวนการจัดการงาน Rework แบบดั้งเดิมที่ใช้เอกสารกระดาษและสเปรดชีตแบบกระจายตัว ประสบปัญหาสำคัญ 4 ประการ:</w:t>
+        <w:t>จากการศึกษาสภาพการปฏิบัติงานจริงในสายการผลิต พบว่ากระบวนการจัดการงาน Rework แบบดั้งเดิมที่ใช้เอกสารกระดาษและสเปรดชีตแบบกระจายตัว ประสบปัญหาสำคัญ 3 ประการ:</w:t>
       </w:r>
     </w:p>
     <w:p>
@@ -3030,7 +2985,7 @@
           <w:sz w:val="32"/>
           <w:rFonts w:ascii="TH Sarabun New" w:hAnsi="TH Sarabun New" w:cs="TH Sarabun New" w:eastAsia="TH Sarabun New"/>
         </w:rPr>
-        <w:t xml:space="preserve">3. ความยากลำบากในการเข้าถึงแบบแปลนและคู่มือเทคนิค: </w:t>
+        <w:t xml:space="preserve">3. ความยากลำบากในการเข้าถึงเอกสารข้อกำหนดผลิตภัณฑ์และสูตรมาตรฐานการผลิต: </w:t>
       </w:r>
       <w:r>
         <w:rPr>
@@ -3040,45 +2995,7 @@
           <w:sz w:val="32"/>
           <w:rFonts w:ascii="TH Sarabun New" w:hAnsi="TH Sarabun New" w:cs="TH Sarabun New" w:eastAsia="TH Sarabun New"/>
         </w:rPr>
-        <w:t>เอกสารแบบแปลนวิศวกรรม (Engineering Drawings) และใบมาสเตอร์การผลิต (Internal Master Sheets) มีปริมาณมากและจัดเก็บในรูปแบบเอกสารสแกน ทำให้พนักงานต้องใช้เวลาเฉลี่ยถึง 18 นาทีต่อครั้งในการค้นหาข้อกำหนดและสูตรการผลิตที่ถูกต้อง</w:t>
-      </w:r>
-    </w:p>
-    <w:p>
-      <w:pPr>
-        <w:widowControl/>
-        <w:spacing w:before="0" w:after="60" w:line="240" w:lineRule="auto"/>
-        <w:ind w:left="720" w:hanging="360"/>
-        <w:jc w:val="both"/>
-      </w:pPr>
-      <w:r>
-        <w:rPr>
-          <w:rFonts w:ascii="TH Sarabun New" w:hAnsi="TH Sarabun New"/>
-          <w:b/>
-          <w:i w:val="0"/>
-          <w:sz w:val="32"/>
-          <w:rFonts w:ascii="TH Sarabun New" w:hAnsi="TH Sarabun New" w:cs="TH Sarabun New" w:eastAsia="TH Sarabun New"/>
-        </w:rPr>
-        <w:t xml:space="preserve">•  </w:t>
-      </w:r>
-      <w:r>
-        <w:rPr>
-          <w:rFonts w:ascii="TH Sarabun New" w:hAnsi="TH Sarabun New"/>
-          <w:b/>
-          <w:i w:val="0"/>
-          <w:sz w:val="32"/>
-          <w:rFonts w:ascii="TH Sarabun New" w:hAnsi="TH Sarabun New" w:cs="TH Sarabun New" w:eastAsia="TH Sarabun New"/>
-        </w:rPr>
-        <w:t xml:space="preserve">4. การขาดการเชื่อมโยงระบบบริหารกำลังพล: </w:t>
-      </w:r>
-      <w:r>
-        <w:rPr>
-          <w:rFonts w:ascii="TH Sarabun New" w:hAnsi="TH Sarabun New"/>
-          <w:b w:val="0"/>
-          <w:i w:val="0"/>
-          <w:sz w:val="32"/>
-          <w:rFonts w:ascii="TH Sarabun New" w:hAnsi="TH Sarabun New" w:cs="TH Sarabun New" w:eastAsia="TH Sarabun New"/>
-        </w:rPr>
-        <w:t>การจัดตารางเวรและกะการทำงาน (Roster Management) แยกขาดจากสถานะงาน Rework ทำให้ไม่สามารถบริหารจัดการภาระงานได้อย่างสอดคล้องกับกำลังพลจริง</w:t>
+        <w:t>เอกสารแบบร่างข้อกำหนดผลิตภัณฑ์ของลูกค้า (Customer Product Drawings) และใบกำหนดสูตรและมาตรฐานการผลิตภายใน (Internal Manufacturing Master Sheets) มีปริมาณมากและจัดเก็บในรูปแบบเอกสารสแกน ส่งผลให้พนักงานต้องใช้เวลาเฉลี่ยถึง 18 นาทีต่อครั้งในการค้นหาข้อกำหนดทางเทคนิคและสูตรการผลิตที่ถูกต้อง</w:t>
       </w:r>
     </w:p>
     <w:p>
@@ -3096,7 +3013,7 @@
           <w:sz w:val="32"/>
           <w:rFonts w:ascii="TH Sarabun New" w:hAnsi="TH Sarabun New" w:cs="TH Sarabun New" w:eastAsia="TH Sarabun New"/>
         </w:rPr>
-        <w:t>เพื่อแก้ไขปัญหาดังกล่าว ผู้จัดทำจึงได้พัฒนา 'ระบบบริหารจัดการกระบวนการแก้ไขผลิตภัณฑ์และคลังเอกสารวิศวกรรมอัจฉริยะ (QSMS: Quality &amp; Rework Management System)' โดยผสานสถาปัตยกรรม Next.js App Router, ฐานข้อมูลเวกเตอร์ Supabase pgvector, เทคโนโลยีปัญญาประดิษฐ์ Multimodal OCR และระบบค้นหาความรู้ RAG เข้าด้วยกันอย่างสมบูรณ์</w:t>
+        <w:t>เพื่อแก้ไขปัญหาดังกล่าว ผู้จัดทำจึงได้พัฒนา 'ระบบบริหารจัดการกระบวนการแก้ไขผลิตภัณฑ์และคลังเอกสารข้อกำหนดมาตรฐานการผลิตอัจฉริยะ (QSMS: Quality &amp; Rework Management System)' โดยผสานสถาปัตยกรรม Next.js App Router, ฐานข้อมูลเวกเตอร์ Supabase pgvector, เทคโนโลยีปัญญาประดิษฐ์ Multimodal OCR สำหรับวิเคราะห์เอกสารแบบร่างและสูตรการผลิต ตลอดจนระบบสืบค้นความรู้อัจฉริยะ (DocAI RAG) เข้าด้วยกันอย่างสมบูรณ์</w:t>
       </w:r>
     </w:p>
     <w:p>
@@ -3152,7 +3069,7 @@
           <w:sz w:val="32"/>
           <w:rFonts w:ascii="TH Sarabun New" w:hAnsi="TH Sarabun New" w:cs="TH Sarabun New" w:eastAsia="TH Sarabun New"/>
         </w:rPr>
-        <w:t>เพื่อออกแบบและพัฒนาระบบเว็บแอปพลิเคชันบริหารจัดการกระบวนการ Rework แบบเรียลไทม์ พร้อมระบบตรวจสอบรหัสสินค้าสองทางอัตโนมัติ (Two-Way Autofill &amp; Verification)</w:t>
+        <w:t>เพื่อออกแบบและพัฒนาระบบเว็บแอปพลิเคชันบริหารจัดการกระบวนการแก้ไขผลิตภัณฑ์ (Rework Management System) แบบเรียลไทม์ พร้อมระบบตรวจสอบรหัสสินค้าสองทางอัตโนมัติ (Two-Way Autofill &amp; Verification) และการรักษาความสมบูรณ์ของภาพถ่ายหลักฐาน (Evidence Integrity)</w:t>
       </w:r>
     </w:p>
     <w:p>
@@ -3190,7 +3107,7 @@
           <w:sz w:val="32"/>
           <w:rFonts w:ascii="TH Sarabun New" w:hAnsi="TH Sarabun New" w:cs="TH Sarabun New" w:eastAsia="TH Sarabun New"/>
         </w:rPr>
-        <w:t>เพื่อพัฒนาระบบวิเคราะห์และสกัดข้อมูลจากแบบแปลนวิศวกรรมและใบมาสเตอร์ PDF ด้วย Gemini Multimodal OCR แบบแยกสกีมา (Decoupled Document Schemas)</w:t>
+        <w:t>เพื่อพัฒนาระบบวิเคราะห์และสกัดข้อมูลจากเอกสารแบบร่างข้อกำหนดผลิตภัณฑ์ (Customer Drawings) และใบกำหนดสูตรมาตรฐานการผลิต (Manufacturing Master Sheets) ในรูปแบบ PDF ด้วยเทคโนโลยี Gemini Multimodal OCR แบบแยกสกีมาโครงสร้างข้อมูล (Decoupled Document Schemas)</w:t>
       </w:r>
     </w:p>
     <w:p>
@@ -3228,7 +3145,7 @@
           <w:sz w:val="32"/>
           <w:rFonts w:ascii="TH Sarabun New" w:hAnsi="TH Sarabun New" w:cs="TH Sarabun New" w:eastAsia="TH Sarabun New"/>
         </w:rPr>
-        <w:t>เพื่อพัฒนาระบบถามตอบคู่มือเทคนิคและแนวทางการแก้ไขงานอัจฉริยะ (DocAI RAG) ด้วย Supabase pgvector และ Jina AI Embeddings</w:t>
+        <w:t>เพื่อพัฒนาระบบถามตอบคู่มือเทคนิคและแนวทางการแก้ไขงานอัจฉริยะ (DocAI RAG) ด้วยการผสานฐานข้อมูลเวกเตอร์ Supabase pgvector ร่วมกับโมเดลการแปลงเวกเตอร์ความหมาย Jina AI Embeddings และระบบค้นหาแบบผสมผสาน (Hybrid Search)</w:t>
       </w:r>
     </w:p>
     <w:p>
@@ -3266,7 +3183,7 @@
           <w:sz w:val="32"/>
           <w:rFonts w:ascii="TH Sarabun New" w:hAnsi="TH Sarabun New" w:cs="TH Sarabun New" w:eastAsia="TH Sarabun New"/>
         </w:rPr>
-        <w:t>เพื่อพัฒนาระบบบริหารจัดการตารางเวรพนักงาน (ShiftHub Roster) และระบบส่งออกรายงาน Excel (.xlsx) ที่ฝังรูปภาพหลักฐานความละเอียดสูงลงในเซลล์โดยตรง</w:t>
+        <w:t>เพื่อพัฒนาระบบส่งออกรายงานสเปรดชีต Excel (.xlsx) ที่ฝังรูปภาพหลักฐานความละเอียดสูงลงในเซลล์ตารางโดยตรง พร้อมระบบสรุปสถิติแดชบอร์ดเพื่อการตัดสินใจเชิงคุณภาพ</w:t>
       </w:r>
     </w:p>
     <w:p>
@@ -3304,7 +3221,7 @@
           <w:sz w:val="32"/>
           <w:rFonts w:ascii="TH Sarabun New" w:hAnsi="TH Sarabun New" w:cs="TH Sarabun New" w:eastAsia="TH Sarabun New"/>
         </w:rPr>
-        <w:t>เพื่อพัฒนาระบบคู่มือนำเสนอเชิงโต้ตอบ (Interactive Presentation Deck) 20 สไลด์ พร้อมระบบควบคุมมุมมองแบบ Direct-Manipulation 1:1 Zoom/Pan</w:t>
+        <w:t>เพื่อพัฒนาระบบคู่มือนำเสนอและสภาพแวดล้อมจำลองเชิงโต้ตอบ (Interactive Presentation Deck &amp; Sandbox) 20 สไลด์ พร้อมกลไกควบคุมมุมมองการนำเสนอแบบ Direct-Manipulation 1:1 Zoom and Pan Engine</w:t>
       </w:r>
     </w:p>
     <w:p>
@@ -3341,7 +3258,7 @@
           <w:sz w:val="32"/>
           <w:rFonts w:ascii="TH Sarabun New" w:hAnsi="TH Sarabun New" w:cs="TH Sarabun New" w:eastAsia="TH Sarabun New"/>
         </w:rPr>
-        <w:t>1.3.1 ขอบเขตด้านการทำงาน (6 โมดูลหลัก)</w:t>
+        <w:t>1.3.1 ขอบเขตด้านการทำงาน (5 โมดูลหลัก)</w:t>
       </w:r>
     </w:p>
     <w:p>
@@ -3369,7 +3286,7 @@
           <w:sz w:val="32"/>
           <w:rFonts w:ascii="TH Sarabun New" w:hAnsi="TH Sarabun New" w:cs="TH Sarabun New" w:eastAsia="TH Sarabun New"/>
         </w:rPr>
-        <w:t xml:space="preserve">Auth Module: </w:t>
+        <w:t xml:space="preserve">Workspace Portal &amp; Auth Shell: </w:t>
       </w:r>
       <w:r>
         <w:rPr>
@@ -3379,7 +3296,7 @@
           <w:sz w:val="32"/>
           <w:rFonts w:ascii="TH Sarabun New" w:hAnsi="TH Sarabun New" w:cs="TH Sarabun New" w:eastAsia="TH Sarabun New"/>
         </w:rPr>
-        <w:t>ระบบยืนยันตัวตนระดับเซิร์ฟเวอร์ (HTTP-Only Cookie Session) และการแบ่งสิทธิ์ RBAC (Admin/QSMS และ Operator/WFG)</w:t>
+        <w:t>ระบบยืนยันตัวตนระดับเซิร์ฟเวอร์ (HTTP-Only Cookie Session), หน้าจอศูนย์รวมแอปพลิเคชัน (Portal Shell) และการแบ่งสิทธิ์ RBAC (Admin/QSMS และ Operator/WFG)</w:t>
       </w:r>
     </w:p>
     <w:p>
@@ -3417,7 +3334,7 @@
           <w:sz w:val="32"/>
           <w:rFonts w:ascii="TH Sarabun New" w:hAnsi="TH Sarabun New" w:cs="TH Sarabun New" w:eastAsia="TH Sarabun New"/>
         </w:rPr>
-        <w:t>การสร้างเคส Multi-Item, การเชื่อมโยงสินค้าเปื้อน-รั่ว (Cross-Item Link), กล่องแนบไฟล์ OR, การอัปเดตยอดกล่อง, และการเปลี่ยนสถานะอัตโนมัติ (Auto-Status)</w:t>
+        <w:t>ระบบบริหารจัดการงานแก้ไขสินค้าแบบครบวงจร ประกอบด้วยฟอร์มสร้างเคส Multi-Item, Two-Way Autofill, การเชื่อมโยงสินค้าเปื้อน-รั่ว (Cross-Item Link), กล่องแนบไฟล์ OR, ตารางภาพรวมพร้อมการจัดลำดับคิวงาน, แผงจัดการเคสพร้อม Item Accordion และ Dynamic Auto-Status, แดชบอร์ดสรุปสถิติและวิเคราะห์ Defect Pareto, และระบบบันทึกด่วนหน้าไลน์บนมือถือ (Mobile Fast-Track)</w:t>
       </w:r>
     </w:p>
     <w:p>
@@ -3445,7 +3362,7 @@
           <w:sz w:val="32"/>
           <w:rFonts w:ascii="TH Sarabun New" w:hAnsi="TH Sarabun New" w:cs="TH Sarabun New" w:eastAsia="TH Sarabun New"/>
         </w:rPr>
-        <w:t xml:space="preserve">Drawing &amp; Master Module: </w:t>
+        <w:t xml:space="preserve">Drawing &amp; Master Storage Module: </w:t>
       </w:r>
       <w:r>
         <w:rPr>
@@ -3455,7 +3372,7 @@
           <w:sz w:val="32"/>
           <w:rFonts w:ascii="TH Sarabun New" w:hAnsi="TH Sarabun New" w:cs="TH Sarabun New" w:eastAsia="TH Sarabun New"/>
         </w:rPr>
-        <w:t>คลังแบบแปลนวิศวกรรม, ระบบ AI OCR สกัด 7-8 ฟิลด์, แผงตรวจทาน Split View 55/45, และระบบหมุน PDF 360 องศา</w:t>
+        <w:t>คลังเอกสารข้อกำหนดผลิตภัณฑ์ของลูกค้าและสูตรมาตรฐานการผลิต, ระบบ AI OCR สกัด 7-8 ฟิลด์, แผงตรวจทาน Split View 55/45, และระบบหมุน PDF 360 องศา</w:t>
       </w:r>
     </w:p>
     <w:p>
@@ -3521,45 +3438,7 @@
           <w:sz w:val="32"/>
           <w:rFonts w:ascii="TH Sarabun New" w:hAnsi="TH Sarabun New" w:cs="TH Sarabun New" w:eastAsia="TH Sarabun New"/>
         </w:rPr>
-        <w:t xml:space="preserve">Roster Module: </w:t>
-      </w:r>
-      <w:r>
-        <w:rPr>
-          <w:rFonts w:ascii="TH Sarabun New" w:hAnsi="TH Sarabun New"/>
-          <w:b w:val="0"/>
-          <w:i w:val="0"/>
-          <w:sz w:val="32"/>
-          <w:rFonts w:ascii="TH Sarabun New" w:hAnsi="TH Sarabun New" w:cs="TH Sarabun New" w:eastAsia="TH Sarabun New"/>
-        </w:rPr>
-        <w:t>ระบบจัดตารางเวรกะพนักงานรายเดือน การสลับวันเสาร์ทำงาน และการสรุปสถิติวันลา</w:t>
-      </w:r>
-    </w:p>
-    <w:p>
-      <w:pPr>
-        <w:widowControl/>
-        <w:spacing w:before="0" w:after="60" w:line="240" w:lineRule="auto"/>
-        <w:ind w:left="720" w:hanging="360"/>
-        <w:jc w:val="both"/>
-      </w:pPr>
-      <w:r>
-        <w:rPr>
-          <w:rFonts w:ascii="TH Sarabun New" w:hAnsi="TH Sarabun New"/>
-          <w:b/>
-          <w:i w:val="0"/>
-          <w:sz w:val="32"/>
-          <w:rFonts w:ascii="TH Sarabun New" w:hAnsi="TH Sarabun New" w:cs="TH Sarabun New" w:eastAsia="TH Sarabun New"/>
-        </w:rPr>
-        <w:t xml:space="preserve">•  </w:t>
-      </w:r>
-      <w:r>
-        <w:rPr>
-          <w:rFonts w:ascii="TH Sarabun New" w:hAnsi="TH Sarabun New"/>
-          <w:b/>
-          <w:i w:val="0"/>
-          <w:sz w:val="32"/>
-          <w:rFonts w:ascii="TH Sarabun New" w:hAnsi="TH Sarabun New" w:cs="TH Sarabun New" w:eastAsia="TH Sarabun New"/>
-        </w:rPr>
-        <w:t xml:space="preserve">Guide Module: </w:t>
+        <w:t xml:space="preserve">Guide &amp; Presentation Module: </w:t>
       </w:r>
       <w:r>
         <w:rPr>
@@ -4118,7 +3997,7 @@
           <w:sz w:val="32"/>
           <w:rFonts w:ascii="TH Sarabun New" w:hAnsi="TH Sarabun New" w:cs="TH Sarabun New" w:eastAsia="TH Sarabun New"/>
         </w:rPr>
-        <w:t>ลดเวลาในการสืบค้นแบบแปลนและคู่มือเทคนิคโรงงานลงได้มากกว่า 90%</w:t>
+        <w:t>ลดเวลาในการสืบค้นเอกสารข้อกำหนดและคู่มือเทคนิคโรงงานลงได้มากกว่า 90%</w:t>
       </w:r>
     </w:p>
     <w:p>
@@ -4257,7 +4136,7 @@
           <w:sz w:val="32"/>
           <w:rFonts w:ascii="TH Sarabun New" w:hAnsi="TH Sarabun New" w:cs="TH Sarabun New" w:eastAsia="TH Sarabun New"/>
         </w:rPr>
-        <w:t>ระบบ QSMS ประยุกต์ใช้สถาปัตยกรรม Hybrid Next.js + React 19 ควบคู่กับระเบียบวิธี Feature-Sliced Design (FSD) ซึ่งเป็นการแบ่งสัดส่วนโค้ดออกเป็นโมดูลอิสระ (Module Slices) ได้แก่ auth, rework, drawings, rag, roster, guide และ platform ข้อดีของสถาปัตยกรรมนี้คือการลดความผูกมัดของโค้ด (Loose Coupling) ป้องกันปัญหาการพึ่งพากันแบบวงกลม (Circular Dependencies) และเอื้อต่อการเขียนชุดทดสอบอัตโนมัติ</w:t>
+        <w:t>ระบบ QSMS ประยุกต์ใช้สถาปัตยกรรม Hybrid Next.js + React 19 ควบคู่กับระเบียบวิธี Feature-Sliced Design (FSD) ซึ่งเป็นการแบ่งสัดส่วนโค้ดออกเป็นโมดูลอิสระ (Module Slices) ได้แก่ auth, rework, drawings, rag, guide และ platform ข้อดีของสถาปัตยกรรมนี้คือการลดความผูกมัดของโค้ด (Loose Coupling) ป้องกันปัญหาการพึ่งพากันแบบวงกลม (Circular Dependencies) และเอื้อต่อการเขียนชุดทดสอบอัตโนมัติ</w:t>
       </w:r>
     </w:p>
     <w:p>
@@ -4369,7 +4248,7 @@
           <w:sz w:val="32"/>
           <w:rFonts w:ascii="TH Sarabun New" w:hAnsi="TH Sarabun New" w:cs="TH Sarabun New" w:eastAsia="TH Sarabun New"/>
         </w:rPr>
-        <w:t>ระบบแบ่งสิทธิ์ผู้ใช้งานออกเป็น 2 ระดับหลัก ได้แก่ (1) Admin/QSMS ซึ่งมีสิทธิ์เต็มในการเข้าถึงแดชบอร์ด แก้ไขข้อมูลเคส และจัดตารางเวร และ (2) Operator/WFG ซึ่งจำกัดสิทธิ์เฉพาะการบันทึกเคสใหม่และการอัปเดตยอดกล่องที่ทำเสร็จ โดยซ่อนฟังก์ชันด้านต้นทุนและแดชบอร์ด</w:t>
+        <w:t>ระบบแบ่งสิทธิ์ผู้ใช้งานออกเป็น 2 ระดับหลัก ได้แก่ (1) Admin/QSMS ซึ่งมีสิทธิ์เต็มในการเข้าถึงแดชบอร์ดและโหมดแก้ไขข้อมูลเคส และ (2) Operator/WFG ซึ่งจำกัดสิทธิ์เฉพาะการบันทึกเคสใหม่และการอัปเดตยอดกล่องที่ทำเสร็จ โดยซ่อนฟังก์ชันด้านต้นทุนและแดชบอร์ด</w:t>
       </w:r>
     </w:p>
     <w:p>
@@ -4405,7 +4284,7 @@
           <w:sz w:val="32"/>
           <w:rFonts w:ascii="TH Sarabun New" w:hAnsi="TH Sarabun New" w:cs="TH Sarabun New" w:eastAsia="TH Sarabun New"/>
         </w:rPr>
-        <w:t>การสกัดข้อมูลจากแบบแปลนวิศวกรรม (Engineering Drawings) และใบมาสเตอร์ ซึ่งมักเป็นไฟล์ PDF ที่ผ่านการสแกน มีความท้าทายเนื่องจากโครงสร้างตารางและตัวอักษรมีความซับซ้อน ระบบ QSMS เลือกใช้โมเดล Google Gemini Multimodal Vision API (`gemini-3.1-flash`) ร่วมกับเทคนิค Structured Outputs (JSON Schema Enforcement) ซึ่งบังคับให้โมเดลส่งผลลัพธ์กลับมาเป็นโครงสร้างข้อมูล JSON ตามสเปกที่กำหนดโดยตรง</w:t>
+        <w:t>การสกัดข้อมูลจากแบบร่างข้อกำหนดผลิตภัณฑ์ของลูกค้า (Customer Drawings) และใบกำหนดสูตรมาตรฐานการผลิต (Master Sheets) ซึ่งเป็นไฟล์ PDF สแกน มีความท้าทายเนื่องจากโครงสร้างตารางและตัวอักษรมีความซับซ้อน ระบบ QSMS เลือกใช้โมเดล Google Gemini Multimodal Vision API (`gemini-3.1-flash`) ร่วมกับเทคนิค Structured Outputs (JSON Schema Enforcement) ซึ่งบังคับให้โมเดลส่งผลลัพธ์กลับมาเป็นโครงสร้างข้อมูล JSON ตามสเปกที่กำหนดโดยตรง</w:t>
       </w:r>
     </w:p>
     <w:p>
@@ -5912,7 +5791,7 @@
                 <w:sz w:val="28"/>
                 <w:rFonts w:ascii="TH Sarabun New" w:hAnsi="TH Sarabun New" w:cs="TH Sarabun New" w:eastAsia="TH Sarabun New"/>
               </w:rPr>
-              <w:t>พัฒนาระบบ AI Multimodal OCR วิเคราะห์แบบแปลนและใบมาสเตอร์</w:t>
+              <w:t>พัฒนาระบบ AI Multimodal OCR วิเคราะห์แบบร่างและใบกำหนดสูตรผลิต</w:t>
             </w:r>
           </w:p>
         </w:tc>
@@ -6175,138 +6054,7 @@
                 <w:sz w:val="28"/>
                 <w:rFonts w:ascii="TH Sarabun New" w:hAnsi="TH Sarabun New" w:cs="TH Sarabun New" w:eastAsia="TH Sarabun New"/>
               </w:rPr>
-              <w:t>พัฒนาระบบจัดตารางเวรพนักงาน ShiftHub Roster &amp; Calendar</w:t>
-            </w:r>
-          </w:p>
-        </w:tc>
-        <w:tc>
-          <w:tcPr>
-            <w:tcW w:type="dxa" w:w="1296"/>
-          </w:tcPr>
-          <w:p>
-            <w:pPr>
-              <w:spacing w:before="60" w:after="60" w:line="240" w:lineRule="auto"/>
-              <w:jc w:val="center"/>
-            </w:pPr>
-            <w:r/>
-            <w:r>
-              <w:rPr>
-                <w:rFonts w:ascii="TH Sarabun New" w:hAnsi="TH Sarabun New"/>
-                <w:b w:val="0"/>
-                <w:i w:val="0"/>
-                <w:sz w:val="28"/>
-                <w:rFonts w:ascii="TH Sarabun New" w:hAnsi="TH Sarabun New" w:cs="TH Sarabun New" w:eastAsia="TH Sarabun New"/>
-              </w:rPr>
-            </w:r>
-          </w:p>
-        </w:tc>
-        <w:tc>
-          <w:tcPr>
-            <w:tcW w:type="dxa" w:w="1296"/>
-          </w:tcPr>
-          <w:p>
-            <w:pPr>
-              <w:spacing w:before="60" w:after="60" w:line="240" w:lineRule="auto"/>
-              <w:jc w:val="center"/>
-            </w:pPr>
-            <w:r/>
-            <w:r>
-              <w:rPr>
-                <w:rFonts w:ascii="TH Sarabun New" w:hAnsi="TH Sarabun New"/>
-                <w:b w:val="0"/>
-                <w:i w:val="0"/>
-                <w:sz w:val="28"/>
-                <w:rFonts w:ascii="TH Sarabun New" w:hAnsi="TH Sarabun New" w:cs="TH Sarabun New" w:eastAsia="TH Sarabun New"/>
-              </w:rPr>
-            </w:r>
-          </w:p>
-        </w:tc>
-        <w:tc>
-          <w:tcPr>
-            <w:tcW w:type="dxa" w:w="1296"/>
-          </w:tcPr>
-          <w:p>
-            <w:pPr>
-              <w:spacing w:before="60" w:after="60" w:line="240" w:lineRule="auto"/>
-              <w:jc w:val="center"/>
-            </w:pPr>
-            <w:r/>
-            <w:r>
-              <w:rPr>
-                <w:rFonts w:ascii="TH Sarabun New" w:hAnsi="TH Sarabun New"/>
-                <w:b w:val="0"/>
-                <w:i w:val="0"/>
-                <w:sz w:val="28"/>
-                <w:rFonts w:ascii="TH Sarabun New" w:hAnsi="TH Sarabun New" w:cs="TH Sarabun New" w:eastAsia="TH Sarabun New"/>
-              </w:rPr>
-              <w:t>■■■■</w:t>
-            </w:r>
-          </w:p>
-        </w:tc>
-        <w:tc>
-          <w:tcPr>
-            <w:tcW w:type="dxa" w:w="1296"/>
-          </w:tcPr>
-          <w:p>
-            <w:pPr>
-              <w:spacing w:before="60" w:after="60" w:line="240" w:lineRule="auto"/>
-              <w:jc w:val="center"/>
-            </w:pPr>
-            <w:r/>
-            <w:r>
-              <w:rPr>
-                <w:rFonts w:ascii="TH Sarabun New" w:hAnsi="TH Sarabun New"/>
-                <w:b w:val="0"/>
-                <w:i w:val="0"/>
-                <w:sz w:val="28"/>
-                <w:rFonts w:ascii="TH Sarabun New" w:hAnsi="TH Sarabun New" w:cs="TH Sarabun New" w:eastAsia="TH Sarabun New"/>
-              </w:rPr>
-            </w:r>
-          </w:p>
-        </w:tc>
-      </w:tr>
-      <w:tr>
-        <w:tc>
-          <w:tcPr>
-            <w:tcW w:type="dxa" w:w="864"/>
-          </w:tcPr>
-          <w:p>
-            <w:pPr>
-              <w:spacing w:before="60" w:after="60" w:line="240" w:lineRule="auto"/>
-              <w:jc w:val="center"/>
-            </w:pPr>
-            <w:r/>
-            <w:r>
-              <w:rPr>
-                <w:rFonts w:ascii="TH Sarabun New" w:hAnsi="TH Sarabun New"/>
-                <w:b w:val="0"/>
-                <w:i w:val="0"/>
-                <w:sz w:val="28"/>
-                <w:rFonts w:ascii="TH Sarabun New" w:hAnsi="TH Sarabun New" w:cs="TH Sarabun New" w:eastAsia="TH Sarabun New"/>
-              </w:rPr>
-              <w:t>7</w:t>
-            </w:r>
-          </w:p>
-        </w:tc>
-        <w:tc>
-          <w:tcPr>
-            <w:tcW w:type="dxa" w:w="3744"/>
-          </w:tcPr>
-          <w:p>
-            <w:pPr>
-              <w:spacing w:before="60" w:after="60" w:line="240" w:lineRule="auto"/>
-              <w:jc w:val="left"/>
-            </w:pPr>
-            <w:r/>
-            <w:r>
-              <w:rPr>
-                <w:rFonts w:ascii="TH Sarabun New" w:hAnsi="TH Sarabun New"/>
-                <w:b w:val="0"/>
-                <w:i w:val="0"/>
-                <w:sz w:val="28"/>
-                <w:rFonts w:ascii="TH Sarabun New" w:hAnsi="TH Sarabun New" w:cs="TH Sarabun New" w:eastAsia="TH Sarabun New"/>
-              </w:rPr>
-              <w:t>พัฒนาระบบรายงาน Excel ฝังรูปภาพในเซลล์ &amp; Presentation Deck</w:t>
+              <w:t>พัฒนาระบบส่งออกรายงาน Excel ฝังรูปภาพในเซลล์ &amp; Presentation Deck</w:t>
             </w:r>
           </w:p>
         </w:tc>
@@ -6415,7 +6163,7 @@
                 <w:sz w:val="28"/>
                 <w:rFonts w:ascii="TH Sarabun New" w:hAnsi="TH Sarabun New" w:cs="TH Sarabun New" w:eastAsia="TH Sarabun New"/>
               </w:rPr>
-              <w:t>8</w:t>
+              <w:t>7</w:t>
             </w:r>
           </w:p>
         </w:tc>
@@ -6547,7 +6295,7 @@
                 <w:sz w:val="28"/>
                 <w:rFonts w:ascii="TH Sarabun New" w:hAnsi="TH Sarabun New" w:cs="TH Sarabun New" w:eastAsia="TH Sarabun New"/>
               </w:rPr>
-              <w:t>9</w:t>
+              <w:t>8</w:t>
             </w:r>
           </w:p>
         </w:tc>
@@ -6731,7 +6479,7 @@
           <w:sz w:val="32"/>
           <w:rFonts w:ascii="TH Sarabun New" w:hAnsi="TH Sarabun New" w:cs="TH Sarabun New" w:eastAsia="TH Sarabun New"/>
         </w:rPr>
-        <w:t>โครงสร้างโฟลเดอร์แบบ Feature-Sliced Design (FSD) ประกอบด้วย 6 โมดูลอิสระ (rework, drawings, rag, roster, guide, platform) ทำหน้าที่บริหารจัดการ State ภายในหน้าจอและบีบอัดภาพก่อนส่งขึ้น CDN</w:t>
+        <w:t>โครงสร้างโฟลเดอร์แบบ Feature-Sliced Design (FSD) ประกอบด้วย 5 โมดูลอิสระ (rework, drawings, rag, guide, platform) ทำหน้าที่บริหารจัดการ State ภายในหน้าจอและบีบอัดภาพก่อนส่งขึ้น CDN</w:t>
       </w:r>
     </w:p>
     <w:p>
@@ -7494,7 +7242,7 @@
                 <w:sz w:val="28"/>
                 <w:rFonts w:ascii="TH Sarabun New" w:hAnsi="TH Sarabun New" w:cs="TH Sarabun New" w:eastAsia="TH Sarabun New"/>
               </w:rPr>
-              <w:t>จัดเก็บเอกสารแบบแปลนและใบมาสเตอร์ พร้อม Metadata ที่สกัดได้จาก Gemini Vision OCR</w:t>
+              <w:t>จัดเก็บเอกสารแบบร่างข้อกำหนดและใบมาสเตอร์สูตรผลิต พร้อม Metadata ที่สกัดได้จาก Gemini Vision OCR</w:t>
             </w:r>
           </w:p>
         </w:tc>
@@ -7928,7 +7676,7 @@
           <w:sz w:val="32"/>
           <w:rFonts w:ascii="TH Sarabun New" w:hAnsi="TH Sarabun New" w:cs="TH Sarabun New" w:eastAsia="TH Sarabun New"/>
         </w:rPr>
-        <w:t>ระบบ QSMS ได้รับการพัฒนาจนเสร็จสมบูรณ์และสามารถทำงานได้ครบทั้ง 6 โมดูลหลัก โดยมีผลการทำงานและภาพหน้าจอจริงของระบบดังนี้:</w:t>
+        <w:t>ระบบ QSMS ได้รับการพัฒนาจนเสร็จสมบูรณ์และสามารถทำงานได้ครบทั้ง 5 โมดูลหลัก โดยมีผลการทำงานและภาพหน้าจอจริงของระบบดังนี้:</w:t>
       </w:r>
     </w:p>
     <w:p>
@@ -8066,7 +7814,7 @@
           <w:sz w:val="32"/>
           <w:rFonts w:ascii="TH Sarabun New" w:hAnsi="TH Sarabun New" w:cs="TH Sarabun New" w:eastAsia="TH Sarabun New"/>
         </w:rPr>
-        <w:t xml:space="preserve">2. Rework Module: </w:t>
+        <w:t xml:space="preserve">2. Rework Module (ระบบบริหารจัดการกระบวนการแก้ไขผลิตภัณฑ์): </w:t>
       </w:r>
       <w:r>
         <w:rPr>
@@ -8076,7 +7824,7 @@
           <w:sz w:val="32"/>
           <w:rFonts w:ascii="TH Sarabun New" w:hAnsi="TH Sarabun New" w:cs="TH Sarabun New" w:eastAsia="TH Sarabun New"/>
         </w:rPr>
-        <w:t>ฟอร์มสร้างเคสรองรับการสืบค้นรหัสสินค้าสองทาง (Two-Way Autofill), การเชื่อมโยงสินค้าเปื้อน-รั่ว (Cross-Item Link), กล่องแนบไฟล์ OR, และหน้าต่างอัปเดตยอดกล่อง ดังแสดงในภาพที่ 4.2</w:t>
+        <w:t>โมดูลหลักสำหรับควบคุมและติดตามวงจรชีวิตของงาน Rework ทั้งหมดในสายการผลิตและงานส่งคืนจากลูกค้า ประกอบด้วย 5 ฟังก์ชันย่อยสำคัญ ดังแสดงในภาพที่ 4.2:</w:t>
       </w:r>
     </w:p>
     <w:p>
@@ -8132,7 +7880,7 @@
           <w:sz w:val="32"/>
           <w:rFonts w:ascii="TH Sarabun New" w:hAnsi="TH Sarabun New" w:cs="TH Sarabun New" w:eastAsia="TH Sarabun New"/>
         </w:rPr>
-        <w:t>ภาพที่ 4.2 หน้าต่างฟอร์มบันทึกเคส Rework พร้อม Two-Way Autofill</w:t>
+        <w:t>ภาพที่ 4.2 หน้าต่างฟอร์มบันทึกเคส Rework พร้อม Two-Way Autofill และการตรวจสอบความถูกต้อง</w:t>
       </w:r>
     </w:p>
     <w:p>
@@ -8149,6 +7897,214 @@
           <w:rFonts w:ascii="TH Sarabun New" w:hAnsi="TH Sarabun New" w:cs="TH Sarabun New" w:eastAsia="TH Sarabun New"/>
         </w:rPr>
         <w:t>(ที่มา: ผู้จัดทำ, 2568)</w:t>
+      </w:r>
+    </w:p>
+    <w:p>
+      <w:pPr>
+        <w:widowControl/>
+        <w:spacing w:before="0" w:after="80" w:line="240" w:lineRule="auto"/>
+        <w:ind w:firstLine="720"/>
+        <w:jc w:val="both"/>
+      </w:pPr>
+      <w:r>
+        <w:rPr>
+          <w:rFonts w:ascii="TH Sarabun New" w:hAnsi="TH Sarabun New"/>
+          <w:b w:val="0"/>
+          <w:i w:val="0"/>
+          <w:sz w:val="32"/>
+          <w:rFonts w:ascii="TH Sarabun New" w:hAnsi="TH Sarabun New" w:cs="TH Sarabun New" w:eastAsia="TH Sarabun New"/>
+        </w:rPr>
+        <w:t>จากภาพที่ 4.2 โมดูล Rework ได้รับการออกแบบให้รองรับกระบวนการแก้ไขผลิตภัณฑ์อย่างครบวงจร โดยครอบคลุม 5 ฟังก์ชันย่อยเชิงปฏิบัติการ ได้แก่:</w:t>
+      </w:r>
+    </w:p>
+    <w:p>
+      <w:pPr>
+        <w:widowControl/>
+        <w:spacing w:before="0" w:after="60" w:line="240" w:lineRule="auto"/>
+        <w:ind w:left="1080" w:hanging="360"/>
+        <w:jc w:val="both"/>
+      </w:pPr>
+      <w:r>
+        <w:rPr>
+          <w:rFonts w:ascii="TH Sarabun New" w:hAnsi="TH Sarabun New"/>
+          <w:b/>
+          <w:i w:val="0"/>
+          <w:sz w:val="32"/>
+          <w:rFonts w:ascii="TH Sarabun New" w:hAnsi="TH Sarabun New" w:cs="TH Sarabun New" w:eastAsia="TH Sarabun New"/>
+        </w:rPr>
+        <w:t xml:space="preserve">•  </w:t>
+      </w:r>
+      <w:r>
+        <w:rPr>
+          <w:rFonts w:ascii="TH Sarabun New" w:hAnsi="TH Sarabun New"/>
+          <w:b/>
+          <w:i w:val="0"/>
+          <w:sz w:val="32"/>
+          <w:rFonts w:ascii="TH Sarabun New" w:hAnsi="TH Sarabun New" w:cs="TH Sarabun New" w:eastAsia="TH Sarabun New"/>
+        </w:rPr>
+        <w:t xml:space="preserve">ก. ฟอร์มบันทึกเคสใหม่และการตรวจสอบสินค้าสองทาง (Add Case &amp; Two-Way Autofill): </w:t>
+      </w:r>
+      <w:r>
+        <w:rPr>
+          <w:rFonts w:ascii="TH Sarabun New" w:hAnsi="TH Sarabun New"/>
+          <w:b w:val="0"/>
+          <w:i w:val="0"/>
+          <w:sz w:val="32"/>
+          <w:rFonts w:ascii="TH Sarabun New" w:hAnsi="TH Sarabun New" w:cs="TH Sarabun New" w:eastAsia="TH Sarabun New"/>
+        </w:rPr>
+        <w:t>ระบบรองรับการออกรหัสเคสอัตโนมัติแบบไฮบริด (เช่น RW012-2026 สำหรับ SFC และ RT012-2026 สำหรับ Customer) ซึ่งมีคุณสมบัติไม่สามารถซ้ำซ้อนหรือแก้ไขได้ (Immutable) เมื่อผู้ใช้กรอกรหัส Item Number (สูตรการผลิต) หรือ Item Code (บาร์โค้ด) ระบบจะค้นหาและดึงข้อมูลจากฐานข้อมูล Item Master มาเติมให้อัตโนมัติ (Debounce 600ms) พร้อมแสดงสถานะการตรวจสอบผ่าน Verification Lifecycle (Idle ➔ Checking ➔ Verified / New / Conflict) นอกจากนี้ยังมีระบบเชื่อมโยงสินค้าเปื้อนกับสินค้าที่รั่วในเคสเดียวกัน (Cross-Item Link บันทึกลง linkedSourceId), ช่องแนบเอกสารอ้างอิงของลูกค้า OR สูงสุด 2 ไฟล์ (.xlsx, .pdf, .png) และการรักษาความสมบูรณ์ของหลักฐาน (Evidence Integrity) บังคับแนบภาพถ่ายชำรุดอย่างน้อย 1 ภาพ บีบอัดภาพฝั่งไคลเอนต์ (300KB) และบันทึกแบบธุรกรรมสมบูรณ์ (Atomic Transaction)</w:t>
+      </w:r>
+    </w:p>
+    <w:p>
+      <w:pPr>
+        <w:widowControl/>
+        <w:spacing w:before="0" w:after="60" w:line="240" w:lineRule="auto"/>
+        <w:ind w:left="1080" w:hanging="360"/>
+        <w:jc w:val="both"/>
+      </w:pPr>
+      <w:r>
+        <w:rPr>
+          <w:rFonts w:ascii="TH Sarabun New" w:hAnsi="TH Sarabun New"/>
+          <w:b/>
+          <w:i w:val="0"/>
+          <w:sz w:val="32"/>
+          <w:rFonts w:ascii="TH Sarabun New" w:hAnsi="TH Sarabun New" w:cs="TH Sarabun New" w:eastAsia="TH Sarabun New"/>
+        </w:rPr>
+        <w:t xml:space="preserve">•  </w:t>
+      </w:r>
+      <w:r>
+        <w:rPr>
+          <w:rFonts w:ascii="TH Sarabun New" w:hAnsi="TH Sarabun New"/>
+          <w:b/>
+          <w:i w:val="0"/>
+          <w:sz w:val="32"/>
+          <w:rFonts w:ascii="TH Sarabun New" w:hAnsi="TH Sarabun New" w:cs="TH Sarabun New" w:eastAsia="TH Sarabun New"/>
+        </w:rPr>
+        <w:t xml:space="preserve">ข. หน้าจอภาพรวมและการจัดลำดับคิวงาน (Overall View &amp; Priority Queue): </w:t>
+      </w:r>
+      <w:r>
+        <w:rPr>
+          <w:rFonts w:ascii="TH Sarabun New" w:hAnsi="TH Sarabun New"/>
+          <w:b w:val="0"/>
+          <w:i w:val="0"/>
+          <w:sz w:val="32"/>
+          <w:rFonts w:ascii="TH Sarabun New" w:hAnsi="TH Sarabun New" w:cs="TH Sarabun New" w:eastAsia="TH Sarabun New"/>
+        </w:rPr>
+        <w:t>ตารางแสดงรายการเคสทั้งหมดแบบเรียลไทม์ พร้อมระบบจัดเรียงลำดับความสำคัญ โดยดันเคสสถานะ Pending (รอดำเนินการ) ขึ้นบนสุดเสมอ เพื่อป้องกันไม่ให้งานตกค้างถูกละเลย จากนั้นจึงตามด้วย In-Progress และ Completed พร้อมระบบตัวกรองขั้นสูง (Advanced Filters) ตามแหล่งที่มา สาเหตุ ผู้รับผิดชอบ และป้ายเตือน Badge สีแดง 'ขาดไฟล์ OR' ในกรณีที่เคสของลูกค้า OR ยังไม่ได้แนบไฟล์เอกสาร</w:t>
+      </w:r>
+    </w:p>
+    <w:p>
+      <w:pPr>
+        <w:widowControl/>
+        <w:spacing w:before="0" w:after="60" w:line="240" w:lineRule="auto"/>
+        <w:ind w:left="1080" w:hanging="360"/>
+        <w:jc w:val="both"/>
+      </w:pPr>
+      <w:r>
+        <w:rPr>
+          <w:rFonts w:ascii="TH Sarabun New" w:hAnsi="TH Sarabun New"/>
+          <w:b/>
+          <w:i w:val="0"/>
+          <w:sz w:val="32"/>
+          <w:rFonts w:ascii="TH Sarabun New" w:hAnsi="TH Sarabun New" w:cs="TH Sarabun New" w:eastAsia="TH Sarabun New"/>
+        </w:rPr>
+        <w:t xml:space="preserve">•  </w:t>
+      </w:r>
+      <w:r>
+        <w:rPr>
+          <w:rFonts w:ascii="TH Sarabun New" w:hAnsi="TH Sarabun New"/>
+          <w:b/>
+          <w:i w:val="0"/>
+          <w:sz w:val="32"/>
+          <w:rFonts w:ascii="TH Sarabun New" w:hAnsi="TH Sarabun New" w:cs="TH Sarabun New" w:eastAsia="TH Sarabun New"/>
+        </w:rPr>
+        <w:t xml:space="preserve">ค. แผงจัดการและอัปเดตงาน Rework (Case Update View &amp; Item Accordion): </w:t>
+      </w:r>
+      <w:r>
+        <w:rPr>
+          <w:rFonts w:ascii="TH Sarabun New" w:hAnsi="TH Sarabun New"/>
+          <w:b w:val="0"/>
+          <w:i w:val="0"/>
+          <w:sz w:val="32"/>
+          <w:rFonts w:ascii="TH Sarabun New" w:hAnsi="TH Sarabun New" w:cs="TH Sarabun New" w:eastAsia="TH Sarabun New"/>
+        </w:rPr>
+        <w:t>หน้าต่างจัดการเคสรองรับการคำนวณสถานะอัตโนมัติ (Dynamic Auto-Status Lifecycle) จากจำนวนกล่องที่ผลิตเสร็จจริงเทียบกับยอดรวมทั้งหมด (Pending ➔ In-Progress ➔ Completed) โดยไม่ต้องเลือกสถานะเอง มีช่องบันทึกอุปสรรคหน้างาน (ขาดกล่อง, ขาดแกลลอน, ขาดน้ำมัน) เพื่อรายงานหัวหน้างานทันที พร้อมระบบพับเก็บรายการสินค้าเป็นค่าเริ่มต้น (Default Folded Item Accordion) และปุ่มลัดสลับ 'ขยาย/พับทั้งหมด' ร่วมกับแถบ Header 2 ชั้นแบบ Responsive ป้องกันปุ่มคำสั่งซ้อนทับกันบนอุปกรณ์พกพา รวมถึงโหมดแก้ไขข้อมูลระดับผู้ดูแล (Admin Edit Mode) พร้อมระบบแจ้งเตือนยืนยันป้องกันข้อมูลสูญหาย (Unsaved Changes Warning Guard)</w:t>
+      </w:r>
+    </w:p>
+    <w:p>
+      <w:pPr>
+        <w:widowControl/>
+        <w:spacing w:before="0" w:after="60" w:line="240" w:lineRule="auto"/>
+        <w:ind w:left="1080" w:hanging="360"/>
+        <w:jc w:val="both"/>
+      </w:pPr>
+      <w:r>
+        <w:rPr>
+          <w:rFonts w:ascii="TH Sarabun New" w:hAnsi="TH Sarabun New"/>
+          <w:b/>
+          <w:i w:val="0"/>
+          <w:sz w:val="32"/>
+          <w:rFonts w:ascii="TH Sarabun New" w:hAnsi="TH Sarabun New" w:cs="TH Sarabun New" w:eastAsia="TH Sarabun New"/>
+        </w:rPr>
+        <w:t xml:space="preserve">•  </w:t>
+      </w:r>
+      <w:r>
+        <w:rPr>
+          <w:rFonts w:ascii="TH Sarabun New" w:hAnsi="TH Sarabun New"/>
+          <w:b/>
+          <w:i w:val="0"/>
+          <w:sz w:val="32"/>
+          <w:rFonts w:ascii="TH Sarabun New" w:hAnsi="TH Sarabun New" w:cs="TH Sarabun New" w:eastAsia="TH Sarabun New"/>
+        </w:rPr>
+        <w:t xml:space="preserve">ง. แดชบอร์ดสรุปสถิติเชิงปฏิบัติการ (Rework Operations &amp; Defect Dashboard): </w:t>
+      </w:r>
+      <w:r>
+        <w:rPr>
+          <w:rFonts w:ascii="TH Sarabun New" w:hAnsi="TH Sarabun New"/>
+          <w:b w:val="0"/>
+          <w:i w:val="0"/>
+          <w:sz w:val="32"/>
+          <w:rFonts w:ascii="TH Sarabun New" w:hAnsi="TH Sarabun New" w:cs="TH Sarabun New" w:eastAsia="TH Sarabun New"/>
+        </w:rPr>
+        <w:t>ระบบประมวลผลและแสดงผลตัวชี้วัดประสิทธิภาพหลัก (KPI Summary Cards) ได้แก่ ยอดเคสรวม, จำนวนกล่องทั้งหมด, อัตราความสำเร็จ (Completion Rate %), และระยะเวลาเฉลี่ยในการปิดเคส (Lead Time) ควบคู่กับแผนภูมิวิเคราะห์สาเหตุชำรุดยอดนิยม (Defect Pareto Analysis) จำแนกตามไลน์การผลิตและกลุ่มผลิตภัณฑ์ ช่วยให้วิศวกรควบคุมคุณภาพสามารถระบุปัญหาคอขวดในกระบวนการผลิตได้อย่างแม่นยำ</w:t>
+      </w:r>
+    </w:p>
+    <w:p>
+      <w:pPr>
+        <w:widowControl/>
+        <w:spacing w:before="0" w:after="60" w:line="240" w:lineRule="auto"/>
+        <w:ind w:left="1080" w:hanging="360"/>
+        <w:jc w:val="both"/>
+      </w:pPr>
+      <w:r>
+        <w:rPr>
+          <w:rFonts w:ascii="TH Sarabun New" w:hAnsi="TH Sarabun New"/>
+          <w:b/>
+          <w:i w:val="0"/>
+          <w:sz w:val="32"/>
+          <w:rFonts w:ascii="TH Sarabun New" w:hAnsi="TH Sarabun New" w:cs="TH Sarabun New" w:eastAsia="TH Sarabun New"/>
+        </w:rPr>
+        <w:t xml:space="preserve">•  </w:t>
+      </w:r>
+      <w:r>
+        <w:rPr>
+          <w:rFonts w:ascii="TH Sarabun New" w:hAnsi="TH Sarabun New"/>
+          <w:b/>
+          <w:i w:val="0"/>
+          <w:sz w:val="32"/>
+          <w:rFonts w:ascii="TH Sarabun New" w:hAnsi="TH Sarabun New" w:cs="TH Sarabun New" w:eastAsia="TH Sarabun New"/>
+        </w:rPr>
+        <w:t xml:space="preserve">จ. ระบบบันทึกด่วนหน้าไลน์ผลิตบนอุปกรณ์พกพา (Mobile Fast-Track UI &amp; Local Draft Queue): </w:t>
+      </w:r>
+      <w:r>
+        <w:rPr>
+          <w:rFonts w:ascii="TH Sarabun New" w:hAnsi="TH Sarabun New"/>
+          <w:b w:val="0"/>
+          <w:i w:val="0"/>
+          <w:sz w:val="32"/>
+          <w:rFonts w:ascii="TH Sarabun New" w:hAnsi="TH Sarabun New" w:cs="TH Sarabun New" w:eastAsia="TH Sarabun New"/>
+        </w:rPr>
+        <w:t>ส่วนต่อประสานแบบ Mobile-First Card Layout ที่ได้รับการปรับแต่งให้เหมาะกับหน้าจอสมาร์ตโฟน (เช่น iPhone 13 ความกว้าง 390px) ขยายชื่อสินค้าเต็มความกว้าง จัดกลุ่มยอดผลิตและหลอดความคืบหน้าเข้ามุมล่างอย่างเป็นระเบียบ พร้อมระบบคิวข้อมูลสำรองในเครื่อง (Local Storage Draft Queue) สำหรับบันทึกข้อมูลร่างเคสต่อเนื่องแม้ในจุดที่สัญญาณอินเทอร์เน็ตหน้าไลน์ผลิตไม่เสถียร และปุ่มผู้ช่วยอัจฉริยะลอยตัว DocAI FAB Icon ที่มุมขวาล่างที่ไม่บดบังปุ่มเปลี่ยนหน้า</w:t>
       </w:r>
     </w:p>
     <w:p>
@@ -8176,7 +8132,7 @@
           <w:sz w:val="32"/>
           <w:rFonts w:ascii="TH Sarabun New" w:hAnsi="TH Sarabun New" w:cs="TH Sarabun New" w:eastAsia="TH Sarabun New"/>
         </w:rPr>
-        <w:t xml:space="preserve">3. Drawing &amp; Master Storage: </w:t>
+        <w:t xml:space="preserve">3. Drawing &amp; Master Storage (คลังข้อกำหนดผลิตภัณฑ์และสูตรมาตรฐานการผลิต): </w:t>
       </w:r>
       <w:r>
         <w:rPr>
@@ -8186,7 +8142,7 @@
           <w:sz w:val="32"/>
           <w:rFonts w:ascii="TH Sarabun New" w:hAnsi="TH Sarabun New" w:cs="TH Sarabun New" w:eastAsia="TH Sarabun New"/>
         </w:rPr>
-        <w:t>คลังจัดเก็บแบบแปลนวิศวกรรมพร้อม AI OCR อัตโนมัติ, การจัดแสดงแบบฟอร์มแยกประเภท Decoupled Forms, และแผงตรวจทานเอกสารแบบ Split View 55/45 พร้อมเครื่องมือหมุน PDF ดังแสดงในภาพที่ 4.3</w:t>
+        <w:t>คลังจัดเก็บเอกสารแบบร่างผลิตภัณฑ์ของลูกค้าและใบกำหนดสูตรมาตรฐานการผลิตพร้อม AI OCR อัตโนมัติ, การจัดแสดงแบบฟอร์มแยกประเภท Decoupled Forms, และแผงตรวจทานเอกสารแบบ Split View 55/45 พร้อมเครื่องมือหมุน PDF ดังแสดงในภาพที่ 4.3</w:t>
       </w:r>
     </w:p>
     <w:p>
@@ -8242,7 +8198,7 @@
           <w:sz w:val="32"/>
           <w:rFonts w:ascii="TH Sarabun New" w:hAnsi="TH Sarabun New" w:cs="TH Sarabun New" w:eastAsia="TH Sarabun New"/>
         </w:rPr>
-        <w:t>ภาพที่ 4.3 แผงตรวจทานแบบแปลนวิศวกรรม Split View 55/45 พร้อมเครื่องมือหมุน PDF</w:t>
+        <w:t>ภาพที่ 4.3 แผงตรวจทานเอกสารข้อกำหนดผลิตภัณฑ์และสูตรมาตรฐานการผลิต Split View 55/45 พร้อมเครื่องมือหมุน PDF</w:t>
       </w:r>
     </w:p>
     <w:p>
@@ -8506,7 +8462,7 @@
           <w:sz w:val="32"/>
           <w:rFonts w:ascii="TH Sarabun New" w:hAnsi="TH Sarabun New" w:cs="TH Sarabun New" w:eastAsia="TH Sarabun New"/>
         </w:rPr>
-        <w:t xml:space="preserve">6. ShiftHub Roster Module: </w:t>
+        <w:t xml:space="preserve">6. Interactive Presentation Deck: </w:t>
       </w:r>
       <w:r>
         <w:rPr>
@@ -8516,117 +8472,7 @@
           <w:sz w:val="32"/>
           <w:rFonts w:ascii="TH Sarabun New" w:hAnsi="TH Sarabun New" w:cs="TH Sarabun New" w:eastAsia="TH Sarabun New"/>
         </w:rPr>
-        <w:t>ปฏิทินจัดตารางเวรและกะการทำงานพนักงานรายเดือน พร้อมสรุปสถิติจำนวนวันทำงานและวันลารายบุคคล ดังแสดงในภาพที่ 4.6</w:t>
-      </w:r>
-    </w:p>
-    <w:p>
-      <w:pPr>
-        <w:spacing w:before="160" w:after="80"/>
-        <w:jc w:val="center"/>
-      </w:pPr>
-      <w:r>
-        <w:drawing>
-          <wp:inline xmlns:a="http://schemas.openxmlformats.org/drawingml/2006/main" xmlns:pic="http://schemas.openxmlformats.org/drawingml/2006/picture">
-            <wp:extent cx="5303520" cy="2744986"/>
-            <wp:docPr id="9" name="Picture 9"/>
-            <wp:cNvGraphicFramePr>
-              <a:graphicFrameLocks noChangeAspect="1"/>
-            </wp:cNvGraphicFramePr>
-            <a:graphic>
-              <a:graphicData uri="http://schemas.openxmlformats.org/drawingml/2006/picture">
-                <pic:pic>
-                  <pic:nvPicPr>
-                    <pic:cNvPr id="0" name="ui_roster.png"/>
-                    <pic:cNvPicPr/>
-                  </pic:nvPicPr>
-                  <pic:blipFill>
-                    <a:blip r:embed="rId22"/>
-                    <a:stretch>
-                      <a:fillRect/>
-                    </a:stretch>
-                  </pic:blipFill>
-                  <pic:spPr>
-                    <a:xfrm>
-                      <a:off x="0" y="0"/>
-                      <a:ext cx="5303520" cy="2744986"/>
-                    </a:xfrm>
-                    <a:prstGeom prst="rect"/>
-                  </pic:spPr>
-                </pic:pic>
-              </a:graphicData>
-            </a:graphic>
-          </wp:inline>
-        </w:drawing>
-      </w:r>
-    </w:p>
-    <w:p>
-      <w:pPr>
-        <w:spacing w:before="120" w:after="40" w:line="240" w:lineRule="auto"/>
-        <w:jc w:val="center"/>
-      </w:pPr>
-      <w:r>
-        <w:rPr>
-          <w:rFonts w:ascii="TH Sarabun New" w:hAnsi="TH Sarabun New"/>
-          <w:b/>
-          <w:i w:val="0"/>
-          <w:sz w:val="32"/>
-          <w:rFonts w:ascii="TH Sarabun New" w:hAnsi="TH Sarabun New" w:cs="TH Sarabun New" w:eastAsia="TH Sarabun New"/>
-        </w:rPr>
-        <w:t>ภาพที่ 4.6 ปฏิทินและระบบจัดตารางเวรพนักงาน ShiftHub Roster</w:t>
-      </w:r>
-    </w:p>
-    <w:p>
-      <w:pPr>
-        <w:spacing w:before="0" w:after="240" w:line="240" w:lineRule="auto"/>
-        <w:jc w:val="center"/>
-      </w:pPr>
-      <w:r>
-        <w:rPr>
-          <w:rFonts w:ascii="TH Sarabun New" w:hAnsi="TH Sarabun New"/>
-          <w:b w:val="0"/>
-          <w:i/>
-          <w:sz w:val="28"/>
-          <w:rFonts w:ascii="TH Sarabun New" w:hAnsi="TH Sarabun New" w:cs="TH Sarabun New" w:eastAsia="TH Sarabun New"/>
-        </w:rPr>
-        <w:t>(ที่มา: ผู้จัดทำ, 2568)</w:t>
-      </w:r>
-    </w:p>
-    <w:p>
-      <w:pPr>
-        <w:widowControl/>
-        <w:spacing w:before="0" w:after="60" w:line="240" w:lineRule="auto"/>
-        <w:ind w:left="720" w:hanging="360"/>
-        <w:jc w:val="both"/>
-      </w:pPr>
-      <w:r>
-        <w:rPr>
-          <w:rFonts w:ascii="TH Sarabun New" w:hAnsi="TH Sarabun New"/>
-          <w:b/>
-          <w:i w:val="0"/>
-          <w:sz w:val="32"/>
-          <w:rFonts w:ascii="TH Sarabun New" w:hAnsi="TH Sarabun New" w:cs="TH Sarabun New" w:eastAsia="TH Sarabun New"/>
-        </w:rPr>
-        <w:t xml:space="preserve">•  </w:t>
-      </w:r>
-      <w:r>
-        <w:rPr>
-          <w:rFonts w:ascii="TH Sarabun New" w:hAnsi="TH Sarabun New"/>
-          <w:b/>
-          <w:i w:val="0"/>
-          <w:sz w:val="32"/>
-          <w:rFonts w:ascii="TH Sarabun New" w:hAnsi="TH Sarabun New" w:cs="TH Sarabun New" w:eastAsia="TH Sarabun New"/>
-        </w:rPr>
-        <w:t xml:space="preserve">7. Interactive Presentation Deck: </w:t>
-      </w:r>
-      <w:r>
-        <w:rPr>
-          <w:rFonts w:ascii="TH Sarabun New" w:hAnsi="TH Sarabun New"/>
-          <w:b w:val="0"/>
-          <w:i w:val="0"/>
-          <w:sz w:val="32"/>
-          <w:rFonts w:ascii="TH Sarabun New" w:hAnsi="TH Sarabun New" w:cs="TH Sarabun New" w:eastAsia="TH Sarabun New"/>
-        </w:rPr>
-        <w:t>สไลด์นำเสนอ 20 สไลด์ สไตล์ Apple Liquid Glass พร้อม Live Interactive Sandbox สำหรับการทดลองใช้งานเสมือนจริง และระบบควบคุมมุมมอง Direct-Manipulation Zoom/Pan 1:1 ดังแสดงในภาพที่ 4.7</w:t>
+        <w:t>สไลด์นำเสนอ 20 สไลด์ สไตล์ Apple Liquid Glass พร้อม Live Interactive Sandbox สำหรับการทดลองใช้งานเสมือนจริง และระบบควบคุมมุมมอง Direct-Manipulation Zoom/Pan 1:1 ดังแสดงในภาพที่ 4.6</w:t>
       </w:r>
     </w:p>
     <w:p>
@@ -8638,7 +8484,7 @@
         <w:drawing>
           <wp:inline xmlns:a="http://schemas.openxmlformats.org/drawingml/2006/main" xmlns:pic="http://schemas.openxmlformats.org/drawingml/2006/picture">
             <wp:extent cx="5303520" cy="3314700"/>
-            <wp:docPr id="10" name="Picture 10"/>
+            <wp:docPr id="9" name="Picture 9"/>
             <wp:cNvGraphicFramePr>
               <a:graphicFrameLocks noChangeAspect="1"/>
             </wp:cNvGraphicFramePr>
@@ -8650,7 +8496,7 @@
                     <pic:cNvPicPr/>
                   </pic:nvPicPr>
                   <pic:blipFill>
-                    <a:blip r:embed="rId23"/>
+                    <a:blip r:embed="rId22"/>
                     <a:stretch>
                       <a:fillRect/>
                     </a:stretch>
@@ -8682,7 +8528,7 @@
           <w:sz w:val="32"/>
           <w:rFonts w:ascii="TH Sarabun New" w:hAnsi="TH Sarabun New" w:cs="TH Sarabun New" w:eastAsia="TH Sarabun New"/>
         </w:rPr>
-        <w:t>ภาพที่ 4.7 สไลด์คู่มือนำเสนอระบบ (Presentation Deck) และระบบ Direct-Manipulation Zoom/Pan</w:t>
+        <w:t>ภาพที่ 4.6 สไลด์คู่มือนำเสนอระบบ (Presentation Deck) และระบบ Direct-Manipulation Zoom/Pan</w:t>
       </w:r>
     </w:p>
     <w:p>
@@ -9703,7 +9549,7 @@
                 <w:sz w:val="28"/>
                 <w:rFonts w:ascii="TH Sarabun New" w:hAnsi="TH Sarabun New" w:cs="TH Sarabun New" w:eastAsia="TH Sarabun New"/>
               </w:rPr>
-              <w:t>เวลาเฉลี่ยในการสืบค้นแบบแปลน/คู่มือ</w:t>
+              <w:t>เวลาเฉลี่ยในการสืบค้นเอกสารข้อกำหนด/คู่มือ</w:t>
             </w:r>
           </w:p>
         </w:tc>
@@ -9945,7 +9791,7 @@
           <w:sz w:val="32"/>
           <w:rFonts w:ascii="TH Sarabun New" w:hAnsi="TH Sarabun New" w:cs="TH Sarabun New" w:eastAsia="TH Sarabun New"/>
         </w:rPr>
-        <w:t>โครงงานการพัฒนาระบบบริหารจัดการกระบวนการแก้ไขผลิตภัณฑ์และคลังเอกสารวิศวกรรมอัจฉริยะ (QSMS) บรรลุวัตถุประสงค์ที่ตั้งไว้ครบถ้วนทุกประการ ระบบสามารถผสานการทำงานระหว่างการจัดการงาน Rework, การจัดเก็บและสกัดข้อมูลแบบแปลนวิศวกรรม, การสืบค้นคู่มือเทคนิคด้วยปัญญาประดิษฐ์ RAG, และการบริหารจัดการตารางเวรพนักงานเข้าสู่ศูนย์กลางเดียวกันได้อย่างไร้รอยต่อ</w:t>
+        <w:t>โครงงานการพัฒนาระบบบริหารจัดการกระบวนการแก้ไขผลิตภัณฑ์และคลังเอกสารข้อกำหนดมาตรฐานการผลิตอัจฉริยะ (QSMS) บรรลุวัตถุประสงค์ที่ตั้งไว้ครบถ้วนทุกประการ ระบบสามารถผสานการทำงานระหว่างการจัดการงาน Rework, การจัดเก็บและสกัดข้อมูลเอกสารข้อกำหนดผลิตภัณฑ์และสูตรการผลิต, และการสืบค้นคู่มือเทคนิคด้วยปัญญาประดิษฐ์ RAG เข้าสู่ศูนย์กลางเดียวกันได้อย่างไร้รอยต่อ</w:t>
       </w:r>
     </w:p>
     <w:p>
@@ -10199,6 +10045,44 @@
           <w:sz w:val="32"/>
           <w:rFonts w:ascii="TH Sarabun New" w:hAnsi="TH Sarabun New" w:cs="TH Sarabun New" w:eastAsia="TH Sarabun New"/>
         </w:rPr>
+        <w:t xml:space="preserve">การจัดเลย์เอาต์การ์ดและปุ่มลอยบนอุปกรณ์พกพา (BUG-028 &amp; BUG-029): </w:t>
+      </w:r>
+      <w:r>
+        <w:rPr>
+          <w:rFonts w:ascii="TH Sarabun New" w:hAnsi="TH Sarabun New"/>
+          <w:b w:val="0"/>
+          <w:i w:val="0"/>
+          <w:sz w:val="32"/>
+          <w:rFonts w:ascii="TH Sarabun New" w:hAnsi="TH Sarabun New" w:cs="TH Sarabun New" w:eastAsia="TH Sarabun New"/>
+        </w:rPr>
+        <w:t>การปรับเปลี่ยนตาราง 3 คอลัมน์เป็น Mobile-First Card Layout บนหน้าจอ 390px (iPhone 13) ร่วมกับแถบ Header แบบ 2 ชั้น (Responsive 2-Tier Header) และการย้ายปุ่ม DocAI เป็น Floating Action Button (FAB) ช่วยขจัดปัญหาตัวหนังสือถูกบีบตัดคำและปุ่มคำสั่งซ้อนทับกันได้อย่างสมบูรณ์</w:t>
+      </w:r>
+    </w:p>
+    <w:p>
+      <w:pPr>
+        <w:widowControl/>
+        <w:spacing w:before="0" w:after="60" w:line="240" w:lineRule="auto"/>
+        <w:ind w:left="720" w:hanging="360"/>
+        <w:jc w:val="both"/>
+      </w:pPr>
+      <w:r>
+        <w:rPr>
+          <w:rFonts w:ascii="TH Sarabun New" w:hAnsi="TH Sarabun New"/>
+          <w:b/>
+          <w:i w:val="0"/>
+          <w:sz w:val="32"/>
+          <w:rFonts w:ascii="TH Sarabun New" w:hAnsi="TH Sarabun New" w:cs="TH Sarabun New" w:eastAsia="TH Sarabun New"/>
+        </w:rPr>
+        <w:t xml:space="preserve">•  </w:t>
+      </w:r>
+      <w:r>
+        <w:rPr>
+          <w:rFonts w:ascii="TH Sarabun New" w:hAnsi="TH Sarabun New"/>
+          <w:b/>
+          <w:i w:val="0"/>
+          <w:sz w:val="32"/>
+          <w:rFonts w:ascii="TH Sarabun New" w:hAnsi="TH Sarabun New" w:cs="TH Sarabun New" w:eastAsia="TH Sarabun New"/>
+        </w:rPr>
         <w:t xml:space="preserve">การแยกสกีมาเอกสาร (Decoupled Schemas): </w:t>
       </w:r>
       <w:r>
@@ -10347,7 +10231,7 @@
     <w:p>
       <w:pPr>
         <w:sectPr>
-          <w:headerReference w:type="default" r:id="rId24"/>
+          <w:headerReference w:type="default" r:id="rId23"/>
           <w:pgSz w:w="11909" w:h="16834"/>
           <w:pgMar w:top="2160" w:right="1440" w:bottom="1440" w:left="2160" w:header="1080" w:footer="1080" w:gutter="0"/>
           <w:cols w:space="720"/>
@@ -10512,7 +10396,7 @@
     <w:p>
       <w:pPr>
         <w:sectPr>
-          <w:headerReference w:type="default" r:id="rId25"/>
+          <w:headerReference w:type="default" r:id="rId24"/>
           <w:pgSz w:w="11909" w:h="16834"/>
           <w:pgMar w:top="2160" w:right="1440" w:bottom="1440" w:left="2160" w:header="1080" w:footer="1080" w:gutter="0"/>
           <w:cols w:space="720"/>
@@ -10680,7 +10564,7 @@
       </w:r>
     </w:p>
     <w:sectPr>
-      <w:headerReference w:type="default" r:id="rId26"/>
+      <w:headerReference w:type="default" r:id="rId25"/>
       <w:pgSz w:w="11909" w:h="16834"/>
       <w:pgMar w:top="2160" w:right="1440" w:bottom="1440" w:left="2160" w:header="1080" w:footer="1080" w:gutter="0"/>
       <w:cols w:space="720"/>

</xml_diff>